<commit_message>
docs: actualiza diagramas y CLAUDE.md tras eliminar herencia de permisos
DiagramaClases.puml/png: saca ObtenerPermisosHeredados de PerfilBLL.
DiagramaSecuencia_CU15: simplifica el flujo (ya no calcula heredados
ni los pinta gris/deshabilitados). CU-15 sigue siendo el mismo caso
de uso, solo con el flujo interno más corto.

De paso corrige una referencia legacy a NODO_PERMISO en la
postcondición de CU-14 (ahora es ROL).
</commit_message>
<xml_diff>
--- a/DIAGRAMAS/CasosDeUso.docx
+++ b/DIAGRAMAS/CasosDeUso.docx
@@ -8963,6 +8963,14 @@
     </w:p>
     <w:p>
       <w:pPr>
+        <w:pStyle w:val="ListBullet"/>
+      </w:pPr>
+      <w:r>
+        <w:t>El padre candidato no es un ancestro por encima del padre actual del rol.</w:t>
+      </w:r>
+    </w:p>
+    <w:p>
+      <w:pPr>
         <w:pStyle w:val="Heading2"/>
       </w:pPr>
       <w:r>
@@ -8982,7 +8990,7 @@
         <w:pStyle w:val="ListBullet"/>
       </w:pPr>
       <w:r>
-        <w:t>El rol queda con su nuevo PADRE_ID en NODO_PERMISO.</w:t>
+        <w:t>El rol queda con su nuevo PADRE_ID en ROL.</w:t>
       </w:r>
     </w:p>
     <w:p>
@@ -9011,6 +9019,14 @@
     </w:p>
     <w:p>
       <w:pPr>
+        <w:pStyle w:val="ListBullet"/>
+      </w:pPr>
+      <w:r>
+        <w:t>Si el padre elegido es un ancestro por encima del padre actual: no se actualiza y se muestra el error.</w:t>
+      </w:r>
+    </w:p>
+    <w:p>
+      <w:pPr>
         <w:pStyle w:val="Heading2"/>
       </w:pPr>
       <w:r>
@@ -9043,7 +9059,7 @@
         <w:pStyle w:val="ListNumber"/>
       </w:pPr>
       <w:r>
-        <w:t>El sistema muestra el combo de padres con candidatos que excluyen el propio rol y su subárbol.</w:t>
+        <w:t>El sistema muestra el combo de padres con candidatos que excluyen el propio rol y su subárbol; los ancestros por encima de su padre actual se muestran pero deshabilitados.</w:t>
       </w:r>
     </w:p>
     <w:p>
@@ -9075,6 +9091,14 @@
         <w:pStyle w:val="ListNumber"/>
       </w:pPr>
       <w:r>
+        <w:t>El sistema verifica que el nuevo padre no sea un ancestro por encima del padre actual del rol.</w:t>
+      </w:r>
+    </w:p>
+    <w:p>
+      <w:pPr>
+        <w:pStyle w:val="ListNumber"/>
+      </w:pPr>
+      <w:r>
         <w:t>El sistema actualiza el campo PADRE_ID del rol.</w:t>
       </w:r>
     </w:p>
@@ -9108,6 +9132,30 @@
       </w:pPr>
       <w:r>
         <w:t>El sistema muestra "No se puede asignar ese padre: generaría una referencia circular".</w:t>
+      </w:r>
+    </w:p>
+    <w:p>
+      <w:pPr>
+        <w:pStyle w:val="ListBullet"/>
+      </w:pPr>
+      <w:r>
+        <w:t>El caso de uso termina sin modificar la jerarquía.</w:t>
+      </w:r>
+    </w:p>
+    <w:p>
+      <w:pPr>
+        <w:pStyle w:val="Heading3"/>
+      </w:pPr>
+      <w:r>
+        <w:t>5b. El nuevo padre es un ancestro por encima del padre actual del rol</w:t>
+      </w:r>
+    </w:p>
+    <w:p>
+      <w:pPr>
+        <w:pStyle w:val="ListBullet"/>
+      </w:pPr>
+      <w:r>
+        <w:t>El sistema muestra "No se puede asignar como padre a un ancestro del padre actual del rol".</w:t>
       </w:r>
     </w:p>
     <w:p>
@@ -9228,6 +9276,28 @@
           <w:p>
             <w:r>
               <w:t>Asignar (ninguno) como padre hace al rol raíz del árbol.</w:t>
+            </w:r>
+          </w:p>
+        </w:tc>
+      </w:tr>
+      <w:tr>
+        <w:tc>
+          <w:tcPr>
+            <w:tcW w:type="dxa" w:w="4703"/>
+          </w:tcPr>
+          <w:p>
+            <w:r>
+              <w:t>RN-04</w:t>
+            </w:r>
+          </w:p>
+        </w:tc>
+        <w:tc>
+          <w:tcPr>
+            <w:tcW w:type="dxa" w:w="4703"/>
+          </w:tcPr>
+          <w:p>
+            <w:r>
+              <w:t>No se puede asignar como nuevo padre a un ancestro ubicado por encima del padre actual del rol; el padre actual sigue siendo una opción válida. El combo muestra esos ancestros pero deshabilitados (no seleccionables).</w:t>
             </w:r>
           </w:p>
         </w:tc>

</xml_diff>